<commit_message>
feat: change mongodb atlas, implement core chat functionality including message schema, file upload support, and real-time messaging components
</commit_message>
<xml_diff>
--- a/document/bao-cao-do-an_cnmoi-ptud-cntt_2025.docx
+++ b/document/bao-cao-do-an_cnmoi-ptud-cntt_2025.docx
@@ -3459,18 +3459,13 @@
         </w:numPr>
       </w:pPr>
       <w:r>
-        <w:t xml:space="preserve">SQL (AWS RDS) </w:t>
-      </w:r>
-    </w:p>
-    <w:p>
-      <w:pPr>
-        <w:numPr>
-          <w:ilvl w:val="1"/>
-          <w:numId w:val="37"/>
-        </w:numPr>
-      </w:pPr>
-      <w:r>
-        <w:t xml:space="preserve">NoSQL (DynamoDB) </w:t>
+        <w:t>NoSQL (DynamoDB</w:t>
+      </w:r>
+      <w:r>
+        <w:t xml:space="preserve"> Atlas</w:t>
+      </w:r>
+      <w:r>
+        <w:t xml:space="preserve">) </w:t>
       </w:r>
     </w:p>
     <w:p>
@@ -4326,10 +4321,10 @@
           <w:b/>
           <w:bCs/>
         </w:rPr>
-        <w:t>Amazon EC2</w:t>
-      </w:r>
-      <w:r>
-        <w:t xml:space="preserve">: Cung cấp máy chủ ảo để deploy backend </w:t>
+        <w:t>Amazon S3</w:t>
+      </w:r>
+      <w:r>
+        <w:t xml:space="preserve">: Lưu trữ file (ảnh, video, tài liệu) </w:t>
       </w:r>
     </w:p>
     <w:p>
@@ -4344,42 +4339,6 @@
           <w:b/>
           <w:bCs/>
         </w:rPr>
-        <w:t>Amazon RDS</w:t>
-      </w:r>
-      <w:r>
-        <w:t xml:space="preserve">: Cơ sở dữ liệu quan hệ (MySQL, PostgreSQL) </w:t>
-      </w:r>
-    </w:p>
-    <w:p>
-      <w:pPr>
-        <w:numPr>
-          <w:ilvl w:val="0"/>
-          <w:numId w:val="50"/>
-        </w:numPr>
-      </w:pPr>
-      <w:r>
-        <w:rPr>
-          <w:b/>
-          <w:bCs/>
-        </w:rPr>
-        <w:t>Amazon S3</w:t>
-      </w:r>
-      <w:r>
-        <w:t xml:space="preserve">: Lưu trữ file (ảnh, video, tài liệu) </w:t>
-      </w:r>
-    </w:p>
-    <w:p>
-      <w:pPr>
-        <w:numPr>
-          <w:ilvl w:val="0"/>
-          <w:numId w:val="50"/>
-        </w:numPr>
-      </w:pPr>
-      <w:r>
-        <w:rPr>
-          <w:b/>
-          <w:bCs/>
-        </w:rPr>
         <w:t>Amazon DynamoDB</w:t>
       </w:r>
       <w:r>
@@ -4531,7 +4490,6 @@
         </w:numPr>
       </w:pPr>
       <w:r>
-        <w:lastRenderedPageBreak/>
         <w:t xml:space="preserve">Lưu trữ media (ảnh, video) </w:t>
       </w:r>
     </w:p>
@@ -4554,6 +4512,7 @@
         </w:numPr>
       </w:pPr>
       <w:r>
+        <w:lastRenderedPageBreak/>
         <w:t>Đảm bảo hệ thống có thể mở rộng khi số lượng người dùng tăng</w:t>
       </w:r>
     </w:p>
@@ -4843,6 +4802,7 @@
         <w:rPr>
           <w:noProof/>
         </w:rPr>
+        <w:lastRenderedPageBreak/>
         <w:drawing>
           <wp:inline distT="0" distB="0" distL="0" distR="0" wp14:anchorId="0F0FBBDE" wp14:editId="19B19385">
             <wp:extent cx="5580380" cy="2271395"/>
@@ -4894,51 +4854,25 @@
       <w:r>
         <w:t xml:space="preserve">Hình </w:t>
       </w:r>
-      <w:r>
-        <w:fldChar w:fldCharType="begin"/>
-      </w:r>
-      <w:r>
-        <w:instrText xml:space="preserve"> STYLEREF 1 \s </w:instrText>
-      </w:r>
-      <w:r>
-        <w:fldChar w:fldCharType="separate"/>
-      </w:r>
-      <w:r>
-        <w:rPr>
-          <w:noProof/>
-        </w:rPr>
-        <w:t>2</w:t>
-      </w:r>
-      <w:r>
-        <w:rPr>
-          <w:noProof/>
-        </w:rPr>
-        <w:fldChar w:fldCharType="end"/>
-      </w:r>
+      <w:fldSimple w:instr=" STYLEREF 1 \s ">
+        <w:r>
+          <w:rPr>
+            <w:noProof/>
+          </w:rPr>
+          <w:t>2</w:t>
+        </w:r>
+      </w:fldSimple>
       <w:r>
         <w:noBreakHyphen/>
       </w:r>
-      <w:r>
-        <w:fldChar w:fldCharType="begin"/>
-      </w:r>
-      <w:r>
-        <w:instrText xml:space="preserve"> SEQ Hình_ \* ARABIC \s 1 </w:instrText>
-      </w:r>
-      <w:r>
-        <w:fldChar w:fldCharType="separate"/>
-      </w:r>
-      <w:r>
-        <w:rPr>
-          <w:noProof/>
-        </w:rPr>
-        <w:t>1</w:t>
-      </w:r>
-      <w:r>
-        <w:rPr>
-          <w:noProof/>
-        </w:rPr>
-        <w:fldChar w:fldCharType="end"/>
-      </w:r>
+      <w:fldSimple w:instr=" SEQ Hình_ \* ARABIC \s 1 ">
+        <w:r>
+          <w:rPr>
+            <w:noProof/>
+          </w:rPr>
+          <w:t>1</w:t>
+        </w:r>
+      </w:fldSimple>
       <w:r>
         <w:t xml:space="preserve"> Node.js development</w:t>
       </w:r>
@@ -4953,6 +4887,9 @@
       <w:bookmarkStart w:id="16" w:name="_Toc226616069"/>
       <w:r>
         <w:t>MongoDB</w:t>
+      </w:r>
+      <w:r>
+        <w:t xml:space="preserve"> Atlas</w:t>
       </w:r>
       <w:r>
         <w:t xml:space="preserve"> / DynamoDB</w:t>
@@ -5118,7 +5055,6 @@
     </w:p>
     <w:p>
       <w:r>
-        <w:lastRenderedPageBreak/>
         <w:t>Amazon DynamoDB là dịch vụ NoSQL do AWS cung cấp, có hiệu năng cao và khả năng mở rộng tự động.</w:t>
       </w:r>
     </w:p>
@@ -5149,6 +5085,7 @@
         </w:numPr>
       </w:pPr>
       <w:r>
+        <w:lastRenderedPageBreak/>
         <w:t xml:space="preserve">Tốc độ đọc/ghi rất nhanh </w:t>
       </w:r>
     </w:p>
@@ -6613,51 +6550,25 @@
       <w:r>
         <w:t xml:space="preserve">Bảng </w:t>
       </w:r>
-      <w:r>
-        <w:fldChar w:fldCharType="begin"/>
-      </w:r>
-      <w:r>
-        <w:instrText xml:space="preserve"> STYLEREF 1 \s </w:instrText>
-      </w:r>
-      <w:r>
-        <w:fldChar w:fldCharType="separate"/>
-      </w:r>
-      <w:r>
-        <w:rPr>
-          <w:noProof/>
-        </w:rPr>
-        <w:t>3</w:t>
-      </w:r>
-      <w:r>
-        <w:rPr>
-          <w:noProof/>
-        </w:rPr>
-        <w:fldChar w:fldCharType="end"/>
-      </w:r>
+      <w:fldSimple w:instr=" STYLEREF 1 \s ">
+        <w:r>
+          <w:rPr>
+            <w:noProof/>
+          </w:rPr>
+          <w:t>3</w:t>
+        </w:r>
+      </w:fldSimple>
       <w:r>
         <w:noBreakHyphen/>
       </w:r>
-      <w:r>
-        <w:fldChar w:fldCharType="begin"/>
-      </w:r>
-      <w:r>
-        <w:instrText xml:space="preserve"> SEQ Bảng \* ARABIC \s 1 </w:instrText>
-      </w:r>
-      <w:r>
-        <w:fldChar w:fldCharType="separate"/>
-      </w:r>
-      <w:r>
-        <w:rPr>
-          <w:noProof/>
-        </w:rPr>
-        <w:t>1</w:t>
-      </w:r>
-      <w:r>
-        <w:rPr>
-          <w:noProof/>
-        </w:rPr>
-        <w:fldChar w:fldCharType="end"/>
-      </w:r>
+      <w:fldSimple w:instr=" SEQ Bảng \* ARABIC \s 1 ">
+        <w:r>
+          <w:rPr>
+            <w:noProof/>
+          </w:rPr>
+          <w:t>1</w:t>
+        </w:r>
+      </w:fldSimple>
       <w:r>
         <w:t xml:space="preserve"> Danh sách tác nhân và mô tả</w:t>
       </w:r>
@@ -10077,51 +9988,25 @@
       <w:r>
         <w:t xml:space="preserve">Bảng </w:t>
       </w:r>
-      <w:r>
-        <w:fldChar w:fldCharType="begin"/>
-      </w:r>
-      <w:r>
-        <w:instrText xml:space="preserve"> STYLEREF 1 \s </w:instrText>
-      </w:r>
-      <w:r>
-        <w:fldChar w:fldCharType="separate"/>
-      </w:r>
-      <w:r>
-        <w:rPr>
-          <w:noProof/>
-        </w:rPr>
-        <w:t>3</w:t>
-      </w:r>
-      <w:r>
-        <w:rPr>
-          <w:noProof/>
-        </w:rPr>
-        <w:fldChar w:fldCharType="end"/>
-      </w:r>
+      <w:fldSimple w:instr=" STYLEREF 1 \s ">
+        <w:r>
+          <w:rPr>
+            <w:noProof/>
+          </w:rPr>
+          <w:t>3</w:t>
+        </w:r>
+      </w:fldSimple>
       <w:r>
         <w:noBreakHyphen/>
       </w:r>
-      <w:r>
-        <w:fldChar w:fldCharType="begin"/>
-      </w:r>
-      <w:r>
-        <w:instrText xml:space="preserve"> SEQ Bảng \* ARABIC \s 1 </w:instrText>
-      </w:r>
-      <w:r>
-        <w:fldChar w:fldCharType="separate"/>
-      </w:r>
-      <w:r>
-        <w:rPr>
-          <w:noProof/>
-        </w:rPr>
-        <w:t>2</w:t>
-      </w:r>
-      <w:r>
-        <w:rPr>
-          <w:noProof/>
-        </w:rPr>
-        <w:fldChar w:fldCharType="end"/>
-      </w:r>
+      <w:fldSimple w:instr=" SEQ Bảng \* ARABIC \s 1 ">
+        <w:r>
+          <w:rPr>
+            <w:noProof/>
+          </w:rPr>
+          <w:t>2</w:t>
+        </w:r>
+      </w:fldSimple>
       <w:r>
         <w:t xml:space="preserve"> Danh sách </w:t>
       </w:r>
@@ -18911,7 +18796,7 @@
       </w:pPr>
       <w:r>
         <w:pict w14:anchorId="78B15C6B">
-          <v:rect id="_x0000_i1064" style="width:0;height:1.5pt" o:hralign="center" o:hrstd="t" o:hr="t" fillcolor="#a0a0a0" stroked="f"/>
+          <v:rect id="_x0000_i1063" style="width:0;height:1.5pt" o:hralign="center" o:hrstd="t" o:hr="t" fillcolor="#a0a0a0" stroked="f"/>
         </w:pict>
       </w:r>
     </w:p>
@@ -19000,7 +18885,7 @@
       </w:pPr>
       <w:r>
         <w:pict w14:anchorId="4733772C">
-          <v:rect id="_x0000_i1065" style="width:0;height:1.5pt" o:hralign="center" o:hrstd="t" o:hr="t" fillcolor="#a0a0a0" stroked="f"/>
+          <v:rect id="_x0000_i1064" style="width:0;height:1.5pt" o:hralign="center" o:hrstd="t" o:hr="t" fillcolor="#a0a0a0" stroked="f"/>
         </w:pict>
       </w:r>
     </w:p>
@@ -19070,7 +18955,7 @@
       </w:pPr>
       <w:r>
         <w:pict w14:anchorId="1C6FA808">
-          <v:rect id="_x0000_i1066" style="width:0;height:1.5pt" o:hralign="center" o:hrstd="t" o:hr="t" fillcolor="#a0a0a0" stroked="f"/>
+          <v:rect id="_x0000_i1065" style="width:0;height:1.5pt" o:hralign="center" o:hrstd="t" o:hr="t" fillcolor="#a0a0a0" stroked="f"/>
         </w:pict>
       </w:r>
     </w:p>
@@ -19128,7 +19013,7 @@
       </w:pPr>
       <w:r>
         <w:pict w14:anchorId="028DF49B">
-          <v:rect id="_x0000_i1067" style="width:0;height:1.5pt" o:hralign="center" o:hrstd="t" o:hr="t" fillcolor="#a0a0a0" stroked="f"/>
+          <v:rect id="_x0000_i1066" style="width:0;height:1.5pt" o:hralign="center" o:hrstd="t" o:hr="t" fillcolor="#a0a0a0" stroked="f"/>
         </w:pict>
       </w:r>
     </w:p>
@@ -19201,7 +19086,7 @@
       <w:r>
         <w:lastRenderedPageBreak/>
         <w:pict w14:anchorId="1AED8C8B">
-          <v:rect id="_x0000_i1068" style="width:0;height:1.5pt" o:hralign="center" o:hrstd="t" o:hr="t" fillcolor="#a0a0a0" stroked="f"/>
+          <v:rect id="_x0000_i1067" style="width:0;height:1.5pt" o:hralign="center" o:hrstd="t" o:hr="t" fillcolor="#a0a0a0" stroked="f"/>
         </w:pict>
       </w:r>
     </w:p>
@@ -19296,7 +19181,7 @@
       </w:pPr>
       <w:r>
         <w:pict w14:anchorId="263566C0">
-          <v:rect id="_x0000_i1069" style="width:0;height:1.5pt" o:hralign="center" o:hrstd="t" o:hr="t" fillcolor="#a0a0a0" stroked="f"/>
+          <v:rect id="_x0000_i1068" style="width:0;height:1.5pt" o:hralign="center" o:hrstd="t" o:hr="t" fillcolor="#a0a0a0" stroked="f"/>
         </w:pict>
       </w:r>
     </w:p>
@@ -19366,7 +19251,7 @@
       </w:pPr>
       <w:r>
         <w:pict w14:anchorId="69B38B58">
-          <v:rect id="_x0000_i1070" style="width:0;height:1.5pt" o:hralign="center" o:hrstd="t" o:hr="t" fillcolor="#a0a0a0" stroked="f"/>
+          <v:rect id="_x0000_i1069" style="width:0;height:1.5pt" o:hralign="center" o:hrstd="t" o:hr="t" fillcolor="#a0a0a0" stroked="f"/>
         </w:pict>
       </w:r>
     </w:p>
@@ -19424,7 +19309,7 @@
       </w:pPr>
       <w:r>
         <w:pict w14:anchorId="27F5A6A2">
-          <v:rect id="_x0000_i1071" style="width:0;height:1.5pt" o:hralign="center" o:hrstd="t" o:hr="t" fillcolor="#a0a0a0" stroked="f"/>
+          <v:rect id="_x0000_i1070" style="width:0;height:1.5pt" o:hralign="center" o:hrstd="t" o:hr="t" fillcolor="#a0a0a0" stroked="f"/>
         </w:pict>
       </w:r>
     </w:p>
@@ -19499,7 +19384,7 @@
       </w:pPr>
       <w:r>
         <w:pict w14:anchorId="16064B67">
-          <v:rect id="_x0000_i1072" style="width:0;height:1.5pt" o:hralign="center" o:hrstd="t" o:hr="t" fillcolor="#a0a0a0" stroked="f"/>
+          <v:rect id="_x0000_i1071" style="width:0;height:1.5pt" o:hralign="center" o:hrstd="t" o:hr="t" fillcolor="#a0a0a0" stroked="f"/>
         </w:pict>
       </w:r>
     </w:p>
@@ -19558,7 +19443,7 @@
       </w:pPr>
       <w:r>
         <w:pict w14:anchorId="0A876AE4">
-          <v:rect id="_x0000_i1073" style="width:0;height:1.5pt" o:hralign="center" o:hrstd="t" o:hr="t" fillcolor="#a0a0a0" stroked="f"/>
+          <v:rect id="_x0000_i1072" style="width:0;height:1.5pt" o:hralign="center" o:hrstd="t" o:hr="t" fillcolor="#a0a0a0" stroked="f"/>
         </w:pict>
       </w:r>
     </w:p>
@@ -19606,7 +19491,7 @@
       </w:pPr>
       <w:r>
         <w:pict w14:anchorId="081C5059">
-          <v:rect id="_x0000_i1074" style="width:0;height:1.5pt" o:hralign="center" o:hrstd="t" o:hr="t" fillcolor="#a0a0a0" stroked="f"/>
+          <v:rect id="_x0000_i1073" style="width:0;height:1.5pt" o:hralign="center" o:hrstd="t" o:hr="t" fillcolor="#a0a0a0" stroked="f"/>
         </w:pict>
       </w:r>
     </w:p>
@@ -19655,7 +19540,7 @@
       </w:pPr>
       <w:r>
         <w:pict w14:anchorId="41431D8E">
-          <v:rect id="_x0000_i1075" style="width:0;height:1.5pt" o:hralign="center" o:hrstd="t" o:hr="t" fillcolor="#a0a0a0" stroked="f"/>
+          <v:rect id="_x0000_i1074" style="width:0;height:1.5pt" o:hralign="center" o:hrstd="t" o:hr="t" fillcolor="#a0a0a0" stroked="f"/>
         </w:pict>
       </w:r>
     </w:p>
@@ -19692,7 +19577,7 @@
       </w:pPr>
       <w:r>
         <w:pict w14:anchorId="46D1A568">
-          <v:rect id="_x0000_i1076" style="width:0;height:1.5pt" o:hralign="center" o:hrstd="t" o:hr="t" fillcolor="#a0a0a0" stroked="f"/>
+          <v:rect id="_x0000_i1075" style="width:0;height:1.5pt" o:hralign="center" o:hrstd="t" o:hr="t" fillcolor="#a0a0a0" stroked="f"/>
         </w:pict>
       </w:r>
     </w:p>
@@ -19751,7 +19636,7 @@
       </w:pPr>
       <w:r>
         <w:pict w14:anchorId="73C351EE">
-          <v:rect id="_x0000_i1077" style="width:0;height:1.5pt" o:hralign="center" o:hrstd="t" o:hr="t" fillcolor="#a0a0a0" stroked="f"/>
+          <v:rect id="_x0000_i1076" style="width:0;height:1.5pt" o:hralign="center" o:hrstd="t" o:hr="t" fillcolor="#a0a0a0" stroked="f"/>
         </w:pict>
       </w:r>
     </w:p>
@@ -19810,7 +19695,7 @@
       </w:pPr>
       <w:r>
         <w:pict w14:anchorId="272B1EC9">
-          <v:rect id="_x0000_i1078" style="width:0;height:1.5pt" o:hralign="center" o:hrstd="t" o:hr="t" fillcolor="#a0a0a0" stroked="f"/>
+          <v:rect id="_x0000_i1077" style="width:0;height:1.5pt" o:hralign="center" o:hrstd="t" o:hr="t" fillcolor="#a0a0a0" stroked="f"/>
         </w:pict>
       </w:r>
     </w:p>

</xml_diff>